<commit_message>
ca10 reply-brief docx: Times New Roman (the typst face) via docx/reference.xml; TOC and TOA page numbers from fb render's multi-pass engine (needles, rIdFtr footers, FORMBOOK_FINAL), page column and dot tab inside the margin; signature block kept together; check.sh --engine docx 16 passed 0 failed (fb-595.63)
</commit_message>
<xml_diff>
--- a/courts/tenth-circuit/court-of-appeals/reply-brief/usage/OUTPUT-reply-brief.docx
+++ b/courts/tenth-circuit/court-of-appeals/reply-brief/usage/OUTPUT-reply-brief.docx
@@ -318,6 +318,7 @@
       <w:pPr>
         <w:pStyle w:val="SectionBreak"/>
         <w:sectPr>
+          <w:footerReference w:type="default" r:id="rIdFtrNone"/>
           <w:type w:val="nextPage"/>
           <w:pgSz w:w="12240" w:h="15840"/>
           <w:pgMar w:top="1440" w:right="1440" w:bottom="1440" w:left="1440" w:header="720" w:footer="720" w:gutter="0"/>
@@ -347,6 +348,15 @@
       <w:r>
         <w:t xml:space="preserve">TABLE OF AUTHORITIES</w:t>
       </w:r>
+      <w:r>
+        <w:t xml:space="preserve"> </w:t>
+      </w:r>
+      <w:r>
+        <w:tab/>
+      </w:r>
+      <w:r>
+        <w:t xml:space="preserve">ii</w:t>
+      </w:r>
     </w:p>
     <w:p>
       <w:pPr>
@@ -355,6 +365,15 @@
       <w:r>
         <w:t xml:space="preserve">INTRODUCTION</w:t>
       </w:r>
+      <w:r>
+        <w:t xml:space="preserve"> </w:t>
+      </w:r>
+      <w:r>
+        <w:tab/>
+      </w:r>
+      <w:r>
+        <w:t xml:space="preserve">1</w:t>
+      </w:r>
     </w:p>
     <w:p>
       <w:pPr>
@@ -363,6 +382,15 @@
       <w:r>
         <w:t xml:space="preserve">ARGUMENT</w:t>
       </w:r>
+      <w:r>
+        <w:t xml:space="preserve"> </w:t>
+      </w:r>
+      <w:r>
+        <w:tab/>
+      </w:r>
+      <w:r>
+        <w:t xml:space="preserve">1</w:t>
+      </w:r>
     </w:p>
     <w:p>
       <w:pPr>
@@ -377,6 +405,15 @@
       <w:r>
         <w:t xml:space="preserve">The United States adequately stated the basis and purpose of its demand for New Mexico’s SVRL.</w:t>
       </w:r>
+      <w:r>
+        <w:t xml:space="preserve"> </w:t>
+      </w:r>
+      <w:r>
+        <w:tab/>
+      </w:r>
+      <w:r>
+        <w:t xml:space="preserve">1</w:t>
+      </w:r>
     </w:p>
     <w:p>
       <w:pPr>
@@ -391,6 +428,15 @@
       <w:r>
         <w:t xml:space="preserve">Courts play a limited role in assessing the Attorney General’s demand under Title III.</w:t>
       </w:r>
+      <w:r>
+        <w:t xml:space="preserve"> </w:t>
+      </w:r>
+      <w:r>
+        <w:tab/>
+      </w:r>
+      <w:r>
+        <w:t xml:space="preserve">1</w:t>
+      </w:r>
     </w:p>
     <w:p>
       <w:pPr>
@@ -405,6 +451,15 @@
       <w:r>
         <w:t xml:space="preserve">The United States stated an adequate “basis” for its demand.</w:t>
       </w:r>
+      <w:r>
+        <w:t xml:space="preserve"> </w:t>
+      </w:r>
+      <w:r>
+        <w:tab/>
+      </w:r>
+      <w:r>
+        <w:t xml:space="preserve">5</w:t>
+      </w:r>
     </w:p>
     <w:p>
       <w:pPr>
@@ -413,6 +468,15 @@
       <w:r>
         <w:t xml:space="preserve">CONCLUSION</w:t>
       </w:r>
+      <w:r>
+        <w:t xml:space="preserve"> </w:t>
+      </w:r>
+      <w:r>
+        <w:tab/>
+      </w:r>
+      <w:r>
+        <w:t xml:space="preserve">8</w:t>
+      </w:r>
     </w:p>
     <w:p>
       <w:pPr>
@@ -421,6 +485,15 @@
       <w:r>
         <w:t xml:space="preserve">CERTIFICATE OF COMPLIANCE WITH TYPE-VOLUME LIMIT, TYPEFACE REQUIREMENTS, AND TYPE STYLE REQUIREMENTS</w:t>
       </w:r>
+      <w:r>
+        <w:t xml:space="preserve"> </w:t>
+      </w:r>
+      <w:r>
+        <w:tab/>
+      </w:r>
+      <w:r>
+        <w:t xml:space="preserve">9</w:t>
+      </w:r>
     </w:p>
     <w:p>
       <w:pPr>
@@ -428,13 +501,22 @@
       </w:pPr>
       <w:r>
         <w:t xml:space="preserve">CERTIFICATE OF SERVICE</w:t>
+      </w:r>
+      <w:r>
+        <w:t xml:space="preserve"> </w:t>
+      </w:r>
+      <w:r>
+        <w:tab/>
+      </w:r>
+      <w:r>
+        <w:t xml:space="preserve">10</w:t>
       </w:r>
     </w:p>
     <w:p>
       <w:pPr>
         <w:pStyle w:val="SectionBreak"/>
         <w:sectPr>
-          <w:footerReference w:type="default" r:id="rId100"/>
+          <w:footerReference w:type="default" r:id="rIdFtrPage"/>
           <w:type w:val="nextPage"/>
           <w:pgSz w:w="12240" w:h="15840"/>
           <w:pgMar w:top="1440" w:right="1440" w:bottom="1440" w:left="1440" w:header="720" w:footer="720" w:gutter="0"/>
@@ -494,7 +576,13 @@
         <w:t xml:space="preserve">400 U.S. 517 (1971)</w:t>
       </w:r>
       <w:r>
-        <w:tab/>
+        <w:t xml:space="preserve"> </w:t>
+      </w:r>
+      <w:r>
+        <w:tab/>
+      </w:r>
+      <w:r>
+        <w:t xml:space="preserve">4</w:t>
       </w:r>
     </w:p>
     <w:p>
@@ -518,7 +606,13 @@
         <w:t xml:space="preserve">306 F.2d 222 (5th Cir. 1962)</w:t>
       </w:r>
       <w:r>
-        <w:tab/>
+        <w:t xml:space="preserve"> </w:t>
+      </w:r>
+      <w:r>
+        <w:tab/>
+      </w:r>
+      <w:r>
+        <w:t xml:space="preserve">2, 3, 4, 7</w:t>
       </w:r>
     </w:p>
     <w:p>
@@ -542,7 +636,13 @@
         <w:t xml:space="preserve">603 U.S. 369 (2024)</w:t>
       </w:r>
       <w:r>
-        <w:tab/>
+        <w:t xml:space="preserve"> </w:t>
+      </w:r>
+      <w:r>
+        <w:tab/>
+      </w:r>
+      <w:r>
+        <w:t xml:space="preserve">6</w:t>
       </w:r>
     </w:p>
     <w:p>
@@ -566,7 +666,13 @@
         <w:t xml:space="preserve">503 U.S. 638 (1992)</w:t>
       </w:r>
       <w:r>
-        <w:tab/>
+        <w:t xml:space="preserve"> </w:t>
+      </w:r>
+      <w:r>
+        <w:tab/>
+      </w:r>
+      <w:r>
+        <w:t xml:space="preserve">5</w:t>
       </w:r>
     </w:p>
     <w:p>
@@ -590,7 +696,13 @@
         <w:t xml:space="preserve">187 F.4th 462 (6th Cir. 2026)</w:t>
       </w:r>
       <w:r>
-        <w:tab/>
+        <w:t xml:space="preserve"> </w:t>
+      </w:r>
+      <w:r>
+        <w:tab/>
+      </w:r>
+      <w:r>
+        <w:t xml:space="preserve">4</w:t>
       </w:r>
     </w:p>
     <w:p>
@@ -614,7 +726,13 @@
         <w:t xml:space="preserve">853 F.3d 1334 (10th Cir. 2017)</w:t>
       </w:r>
       <w:r>
-        <w:tab/>
+        <w:t xml:space="preserve"> </w:t>
+      </w:r>
+      <w:r>
+        <w:tab/>
+      </w:r>
+      <w:r>
+        <w:t xml:space="preserve">6</w:t>
       </w:r>
     </w:p>
     <w:p>
@@ -638,7 +756,13 @@
         <w:t xml:space="preserve">338 U.S. 632 (1950)</w:t>
       </w:r>
       <w:r>
-        <w:tab/>
+        <w:t xml:space="preserve"> </w:t>
+      </w:r>
+      <w:r>
+        <w:tab/>
+      </w:r>
+      <w:r>
+        <w:t xml:space="preserve">7</w:t>
       </w:r>
     </w:p>
     <w:p>
@@ -662,7 +786,13 @@
         <w:t xml:space="preserve">379 U.S. 48 (1964)</w:t>
       </w:r>
       <w:r>
-        <w:tab/>
+        <w:t xml:space="preserve"> </w:t>
+      </w:r>
+      <w:r>
+        <w:tab/>
+      </w:r>
+      <w:r>
+        <w:t xml:space="preserve">2, 3</w:t>
       </w:r>
     </w:p>
     <w:p>
@@ -685,7 +815,13 @@
         <w:t xml:space="preserve">26 U.S.C. 7602(a)(1)</w:t>
       </w:r>
       <w:r>
-        <w:tab/>
+        <w:t xml:space="preserve"> </w:t>
+      </w:r>
+      <w:r>
+        <w:tab/>
+      </w:r>
+      <w:r>
+        <w:t xml:space="preserve">3</w:t>
       </w:r>
     </w:p>
     <w:p>
@@ -696,7 +832,13 @@
         <w:t xml:space="preserve">26 U.S.C. 7605(b)</w:t>
       </w:r>
       <w:r>
-        <w:tab/>
+        <w:t xml:space="preserve"> </w:t>
+      </w:r>
+      <w:r>
+        <w:tab/>
+      </w:r>
+      <w:r>
+        <w:t xml:space="preserve">3</w:t>
       </w:r>
     </w:p>
     <w:p>
@@ -707,7 +849,13 @@
         <w:t xml:space="preserve">52 U.S.C. 20703</w:t>
       </w:r>
       <w:r>
-        <w:tab/>
+        <w:t xml:space="preserve"> </w:t>
+      </w:r>
+      <w:r>
+        <w:tab/>
+      </w:r>
+      <w:r>
+        <w:t xml:space="preserve">2</w:t>
       </w:r>
     </w:p>
     <w:p>
@@ -718,7 +866,13 @@
         <w:t xml:space="preserve">52 U.S.C. 20704</w:t>
       </w:r>
       <w:r>
-        <w:tab/>
+        <w:t xml:space="preserve"> </w:t>
+      </w:r>
+      <w:r>
+        <w:tab/>
+      </w:r>
+      <w:r>
+        <w:t xml:space="preserve">4</w:t>
       </w:r>
     </w:p>
     <w:p>
@@ -729,7 +883,13 @@
         <w:t xml:space="preserve">52 U.S.C. 20705</w:t>
       </w:r>
       <w:r>
-        <w:tab/>
+        <w:t xml:space="preserve"> </w:t>
+      </w:r>
+      <w:r>
+        <w:tab/>
+      </w:r>
+      <w:r>
+        <w:t xml:space="preserve">3</w:t>
       </w:r>
     </w:p>
     <w:p>
@@ -752,7 +912,13 @@
         <w:t xml:space="preserve">Fed. R. Civ. P. 81(a)(5)</w:t>
       </w:r>
       <w:r>
-        <w:tab/>
+        <w:t xml:space="preserve"> </w:t>
+      </w:r>
+      <w:r>
+        <w:tab/>
+      </w:r>
+      <w:r>
+        <w:t xml:space="preserve">4</w:t>
       </w:r>
     </w:p>
     <w:p>
@@ -775,7 +941,13 @@
         <w:t xml:space="preserve">106 Cong. Rec. 6392 (1960)</w:t>
       </w:r>
       <w:r>
-        <w:tab/>
+        <w:t xml:space="preserve"> </w:t>
+      </w:r>
+      <w:r>
+        <w:tab/>
+      </w:r>
+      <w:r>
+        <w:t xml:space="preserve">6</w:t>
       </w:r>
     </w:p>
     <w:p>
@@ -786,7 +958,13 @@
         <w:t xml:space="preserve">106 Cong. Rec. 7767 (1960)</w:t>
       </w:r>
       <w:r>
-        <w:tab/>
+        <w:t xml:space="preserve"> </w:t>
+      </w:r>
+      <w:r>
+        <w:tab/>
+      </w:r>
+      <w:r>
+        <w:t xml:space="preserve">6</w:t>
       </w:r>
     </w:p>
     <w:p>
@@ -797,14 +975,20 @@
         <w:t xml:space="preserve">Webster’s New World Dictionary of the American Language (8th coll. ed. 1960)</w:t>
       </w:r>
       <w:r>
-        <w:tab/>
+        <w:t xml:space="preserve"> </w:t>
+      </w:r>
+      <w:r>
+        <w:tab/>
+      </w:r>
+      <w:r>
+        <w:t xml:space="preserve">5</w:t>
       </w:r>
     </w:p>
     <w:p>
       <w:pPr>
         <w:pStyle w:val="SectionBreak"/>
         <w:sectPr>
-          <w:footerReference w:type="default" r:id="rId100"/>
+          <w:footerReference w:type="default" r:id="rIdFtrPage"/>
           <w:type w:val="nextPage"/>
           <w:pgSz w:w="12240" w:h="15840"/>
           <w:pgMar w:top="1440" w:right="1440" w:bottom="1440" w:left="1440" w:header="720" w:footer="720" w:gutter="0"/>
@@ -932,7 +1116,7 @@
         <w:rPr>
           <w:rStyle w:val="FootnoteReference"/>
         </w:rPr>
-        <w:footnoteReference w:id="109"/>
+        <w:footnoteReference w:id="9"/>
       </w:r>
     </w:p>
     <w:p>
@@ -1599,7 +1783,7 @@
       <w:pPr>
         <w:pStyle w:val="SectionBreak"/>
         <w:sectPr>
-          <w:footerReference w:type="default" r:id="rId100"/>
+          <w:footerReference w:type="default" r:id="rIdFtrPage"/>
           <w:type w:val="nextPage"/>
           <w:pgSz w:w="12240" w:h="15840"/>
           <w:pgMar w:top="1440" w:right="1440" w:bottom="1440" w:left="1440" w:header="720" w:footer="720" w:gutter="0"/>
@@ -1628,7 +1812,7 @@
         <w:pStyle w:val="Single"/>
       </w:pPr>
       <w:r>
-        <w:t xml:space="preserve">2. This document complies with the typeface requirements of Fed. R. App. P. 32(a)(5) and the type style requirements of Fed. R. App. P. 32(a)(6) because this document has been prepared in a proportionally spaced typeface, EB Garamond, in 14-point type.</w:t>
+        <w:t xml:space="preserve">2. This document complies with the typeface requirements of Fed. R. App. P. 32(a)(5) and the type style requirements of Fed. R. App. P. 32(a)(6) because this document has been prepared in a proportionally spaced typeface, Times New Roman, in 14-point type.</w:t>
       </w:r>
     </w:p>
     <w:p>
@@ -1663,7 +1847,7 @@
       <w:pPr>
         <w:pStyle w:val="SectionBreak"/>
         <w:sectPr>
-          <w:footerReference w:type="default" r:id="rId100"/>
+          <w:footerReference w:type="default" r:id="rIdFtrPage"/>
           <w:type w:val="nextPage"/>
           <w:pgSz w:w="12240" w:h="15840"/>
           <w:pgMar w:top="1440" w:right="1440" w:bottom="1440" w:left="1440" w:header="720" w:footer="720" w:gutter="0"/>
@@ -1716,7 +1900,8 @@
       </w:r>
     </w:p>
     <w:sectPr>
-      <w:footerReference w:type="default" r:id="rId100"/>
+      <w:footerReference w:type="default" r:id="rIdFtrPage"/>
+      <w:type w:val="nextPage"/>
       <w:pgSz w:w="12240" w:h="15840"/>
       <w:pgMar w:top="1440" w:right="1440" w:bottom="1440" w:left="1440" w:header="720" w:footer="720" w:gutter="0"/>
       <w:pgNumType w:fmt="decimal"/>
@@ -1729,15 +1914,54 @@
 <w:comments xmlns:w="http://schemas.openxmlformats.org/wordprocessingml/2006/main" xmlns:m="http://schemas.openxmlformats.org/officeDocument/2006/math" xmlns:r="http://schemas.openxmlformats.org/officeDocument/2006/relationships" xmlns:o="urn:schemas-microsoft-com:office:office" xmlns:v="urn:schemas-microsoft-com:vml" xmlns:w10="urn:schemas-microsoft-com:office:word" xmlns:a="http://schemas.openxmlformats.org/drawingml/2006/main" xmlns:pic="http://schemas.openxmlformats.org/drawingml/2006/picture" xmlns:wp="http://schemas.openxmlformats.org/drawingml/2006/wordprocessingDrawing"/>
 </file>
 
-<file path=word/footer1.xml><?xml version="1.0" encoding="utf-8"?>
+<file path=word/footnotes.xml><?xml version="1.0" encoding="utf-8"?>
+<w:footnotes xmlns:w="http://schemas.openxmlformats.org/wordprocessingml/2006/main" xmlns:m="http://schemas.openxmlformats.org/officeDocument/2006/math" xmlns:r="http://schemas.openxmlformats.org/officeDocument/2006/relationships" xmlns:o="urn:schemas-microsoft-com:office:office" xmlns:v="urn:schemas-microsoft-com:vml" xmlns:w10="urn:schemas-microsoft-com:office:word" xmlns:a="http://schemas.openxmlformats.org/drawingml/2006/main" xmlns:pic="http://schemas.openxmlformats.org/drawingml/2006/picture" xmlns:wp="http://schemas.openxmlformats.org/drawingml/2006/wordprocessingDrawing">
+  <w:footnote w:type="continuationSeparator" w:id="0">
+    <w:p>
+      <w:r>
+        <w:continuationSeparator/>
+      </w:r>
+    </w:p>
+  </w:footnote>
+  <w:footnote w:type="separator" w:id="-1">
+    <w:p>
+      <w:r>
+        <w:separator/>
+      </w:r>
+    </w:p>
+  </w:footnote>
+  <w:footnote w:id="9">
+    <w:p>
+      <w:pPr>
+        <w:pStyle w:val="FootnoteText"/>
+      </w:pPr>
+      <w:r>
+        <w:rPr>
+          <w:rStyle w:val="FootnoteReference"/>
+        </w:rPr>
+        <w:footnoteRef/>
+      </w:r>
+      <w:r>
+        <w:t xml:space="preserve"> </w:t>
+      </w:r>
+      <w:r>
+        <w:t xml:space="preserve">“JA,” refers to the Joint Appendix filed in this appeal. “Sec’y Br.,” “Alliance Br.,” and “Common Cause Br.” refer, respectively, to the principal briefs filed by Secretary Toulouse Oliver, the New Mexico Alliance for Retired Americans, and Common Cause, Claudia Medina, and Justin Allen. “U.S. Br.,” refers to the United States’ opening brief. “DNC Br.” and “EPIC Br.” refer, respectively, to the amicus briefs filed by the Democratic National Committee and Electronic Privacy Information Center.</w:t>
+      </w:r>
+    </w:p>
+  </w:footnote>
+</w:footnotes>
+</file>
+
+<file path=word/ftr-add.xml><?xml version="1.0" encoding="utf-8"?>
 <w:ftr xmlns:w="http://schemas.openxmlformats.org/wordprocessingml/2006/main" xmlns:r="http://schemas.openxmlformats.org/officeDocument/2006/relationships">
   <w:p>
     <w:pPr>
-      <w:pStyle w:val="Footer"/>
+      <w:spacing w:before="0" w:after="0"/>
       <w:jc w:val="center"/>
-      <w:spacing w:after="0" w:line="240" w:lineRule="auto"/>
-      <w:ind w:firstLine="0"/>
-    </w:pPr>
+    </w:pPr>
+    <w:r>
+      <w:t>Add-</w:t>
+    </w:r>
     <w:r>
       <w:fldChar w:fldCharType="begin"/>
     </w:r>
@@ -1757,42 +1981,41 @@
 </w:ftr>
 </file>
 
-<file path=word/footnotes.xml><?xml version="1.0" encoding="utf-8"?>
-<w:footnotes xmlns:w="http://schemas.openxmlformats.org/wordprocessingml/2006/main" xmlns:m="http://schemas.openxmlformats.org/officeDocument/2006/math" xmlns:r="http://schemas.openxmlformats.org/officeDocument/2006/relationships" xmlns:o="urn:schemas-microsoft-com:office:office" xmlns:v="urn:schemas-microsoft-com:vml" xmlns:w10="urn:schemas-microsoft-com:office:word" xmlns:a="http://schemas.openxmlformats.org/drawingml/2006/main" xmlns:pic="http://schemas.openxmlformats.org/drawingml/2006/picture" xmlns:wp="http://schemas.openxmlformats.org/drawingml/2006/wordprocessingDrawing">
-  <w:footnote w:type="continuationSeparator" w:id="0">
-    <w:p>
-      <w:r>
-        <w:continuationSeparator/>
-      </w:r>
-    </w:p>
-  </w:footnote>
-  <w:footnote w:type="separator" w:id="-1">
-    <w:p>
-      <w:r>
-        <w:separator/>
-      </w:r>
-    </w:p>
-  </w:footnote>
-  <w:footnote w:id="109">
-    <w:p>
-      <w:pPr>
-        <w:pStyle w:val="FootnoteText"/>
-      </w:pPr>
-      <w:r>
-        <w:rPr>
-          <w:rStyle w:val="FootnoteReference"/>
-        </w:rPr>
-        <w:footnoteRef/>
-      </w:r>
-      <w:r>
-        <w:t xml:space="preserve"> </w:t>
-      </w:r>
-      <w:r>
-        <w:t xml:space="preserve">“JA,” refers to the Joint Appendix filed in this appeal. “Sec’y Br.,” “Alliance Br.,” and “Common Cause Br.” refer, respectively, to the principal briefs filed by Secretary Toulouse Oliver, the New Mexico Alliance for Retired Americans, and Common Cause, Claudia Medina, and Justin Allen. “U.S. Br.,” refers to the United States’ opening brief. “DNC Br.” and “EPIC Br.” refer, respectively, to the amicus briefs filed by the Democratic National Committee and Electronic Privacy Information Center.</w:t>
-      </w:r>
-    </w:p>
-  </w:footnote>
-</w:footnotes>
+<file path=word/ftr-none.xml><?xml version="1.0" encoding="utf-8"?>
+<w:ftr xmlns:w="http://schemas.openxmlformats.org/wordprocessingml/2006/main" xmlns:r="http://schemas.openxmlformats.org/officeDocument/2006/relationships">
+  <w:p>
+    <w:pPr>
+      <w:spacing w:before="0" w:after="0"/>
+      <w:jc w:val="center"/>
+    </w:pPr>
+  </w:p>
+</w:ftr>
+</file>
+
+<file path=word/ftr-page.xml><?xml version="1.0" encoding="utf-8"?>
+<w:ftr xmlns:w="http://schemas.openxmlformats.org/wordprocessingml/2006/main" xmlns:r="http://schemas.openxmlformats.org/officeDocument/2006/relationships">
+  <w:p>
+    <w:pPr>
+      <w:spacing w:before="0" w:after="0"/>
+      <w:jc w:val="center"/>
+    </w:pPr>
+    <w:r>
+      <w:fldChar w:fldCharType="begin"/>
+    </w:r>
+    <w:r>
+      <w:instrText xml:space="preserve"> PAGE </w:instrText>
+    </w:r>
+    <w:r>
+      <w:fldChar w:fldCharType="separate"/>
+    </w:r>
+    <w:r>
+      <w:t>1</w:t>
+    </w:r>
+    <w:r>
+      <w:fldChar w:fldCharType="end"/>
+    </w:r>
+  </w:p>
+</w:ftr>
 </file>
 
 <file path=word/numbering.xml><?xml version="1.0" encoding="utf-8"?>
@@ -1884,7 +2107,7 @@
   <w:docDefaults>
     <w:rPrDefault>
       <w:rPr>
-        <w:rFonts w:ascii="EB Garamond" w:hAnsi="EB Garamond" w:eastAsia="EB Garamond" w:cs="EB Garamond"/>
+        <w:rFonts w:ascii="Times New Roman" w:hAnsi="Times New Roman" w:eastAsia="Times New Roman" w:cs="Times New Roman"/>
         <w:sz w:val="28"/>
         <w:szCs w:val="28"/>
         <w:lang w:val="en-US" w:eastAsia="en-US" w:bidi="ar-SA"/>
@@ -2198,7 +2421,7 @@
     <w:name w:val="Verbatim Char"/>
     <w:basedOn w:val="DefaultParagraphFont"/>
     <w:rPr>
-      <w:rFonts w:ascii="EB Garamond" w:hAnsi="EB Garamond"/>
+      <w:rFonts w:ascii="Times New Roman" w:hAnsi="Times New Roman"/>
     </w:rPr>
   </w:style>
   <w:style w:type="paragraph" w:styleId="Footer">
@@ -2365,10 +2588,10 @@
     <w:qFormat/>
     <w:pPr>
       <w:tabs>
-        <w:tab w:val="left" w:pos="720"/>
+        <w:tab w:val="right" w:leader="dot" w:pos="9340"/>
       </w:tabs>
       <w:spacing w:before="120" w:after="120" w:line="240" w:lineRule="auto"/>
-      <w:ind w:left="720" w:right="0" w:hanging="720" w:firstLine="0"/>
+      <w:ind w:left="720" w:right="720" w:hanging="720"/>
     </w:pPr>
   </w:style>
   <w:style w:type="paragraph" w:customStyle="1" w:styleId="TOCK1">
@@ -2376,10 +2599,7 @@
     <w:basedOn w:val="TOCK0"/>
     <w:qFormat/>
     <w:pPr>
-      <w:tabs>
-        <w:tab w:val="left" w:pos="1440"/>
-      </w:tabs>
-      <w:ind w:left="1440" w:right="0" w:hanging="720" w:firstLine="0"/>
+      <w:ind w:left="1440" w:right="720" w:hanging="720"/>
     </w:pPr>
   </w:style>
   <w:style w:type="paragraph" w:customStyle="1" w:styleId="TOCK2">
@@ -2387,10 +2607,7 @@
     <w:basedOn w:val="TOCK0"/>
     <w:qFormat/>
     <w:pPr>
-      <w:tabs>
-        <w:tab w:val="left" w:pos="2160"/>
-      </w:tabs>
-      <w:ind w:left="2160" w:right="0" w:hanging="720" w:firstLine="0"/>
+      <w:ind w:left="2160" w:right="720" w:hanging="720"/>
     </w:pPr>
   </w:style>
   <w:style w:type="paragraph" w:customStyle="1" w:styleId="TOCK3">
@@ -2398,10 +2615,7 @@
     <w:basedOn w:val="TOCK0"/>
     <w:qFormat/>
     <w:pPr>
-      <w:tabs>
-        <w:tab w:val="left" w:pos="2880"/>
-      </w:tabs>
-      <w:ind w:left="2880" w:right="0" w:hanging="720" w:firstLine="0"/>
+      <w:ind w:left="2880" w:right="720" w:hanging="720"/>
     </w:pPr>
   </w:style>
   <w:style w:type="paragraph" w:customStyle="1" w:styleId="TOCK4">
@@ -2409,10 +2623,7 @@
     <w:basedOn w:val="TOCK0"/>
     <w:qFormat/>
     <w:pPr>
-      <w:tabs>
-        <w:tab w:val="left" w:pos="3600"/>
-      </w:tabs>
-      <w:ind w:left="3600" w:right="0" w:hanging="720" w:firstLine="0"/>
+      <w:ind w:left="3600" w:right="720" w:hanging="720"/>
     </w:pPr>
   </w:style>
   <w:style w:type="paragraph" w:customStyle="1" w:styleId="TOALine">
@@ -2421,10 +2632,10 @@
     <w:qFormat/>
     <w:pPr>
       <w:tabs>
-        <w:tab w:val="right" w:leader="dot" w:pos="9360"/>
+        <w:tab w:val="right" w:leader="dot" w:pos="9340"/>
       </w:tabs>
       <w:spacing w:before="140" w:after="0" w:line="240" w:lineRule="auto"/>
-      <w:ind w:left="504" w:right="0" w:hanging="504" w:firstLine="0"/>
+      <w:ind w:left="504" w:right="1120" w:hanging="504" w:firstLine="0"/>
     </w:pPr>
   </w:style>
   <w:style w:type="paragraph" w:customStyle="1" w:styleId="TOAGroup">
@@ -2486,6 +2697,7 @@
     <w:name w:val="Gap Sig"/>
     <w:basedOn w:val="Normal"/>
     <w:pPr>
+      <w:keepNext/>
       <w:spacing w:before="0" w:after="0" w:line="340" w:lineRule="exact"/>
       <w:ind w:firstLine="0"/>
     </w:pPr>
@@ -2900,7 +3112,7 @@
     </a:clrScheme>
     <a:fontScheme name="Office">
       <a:majorFont>
-        <a:latin typeface="Aptos Display" panose="02110004020202020204"/>
+        <a:latin typeface="Times New Roman" panose="02110004020202020204"/>
         <a:ea typeface=""/>
         <a:cs typeface=""/>
         <a:font script="Jpan" typeface="游ゴシック Light"/>
@@ -2952,7 +3164,7 @@
         <a:font script="Tfng" typeface="Ebrima"/>
       </a:majorFont>
       <a:minorFont>
-        <a:latin typeface="Aptos" panose="02110004020202020204"/>
+        <a:latin typeface="Times New Roman" panose="02110004020202020204"/>
         <a:ea typeface=""/>
         <a:cs typeface=""/>
         <a:font script="Jpan" typeface="游明朝"/>

</xml_diff>